<commit_message>
Fix cấu trúc: thêm heading PHẢN BIỆN + VIẾT TẮT cho 16 file
- Sửa heading style theo mẫu Jenkins (Heading 2, đỏ)
- Kiểm tra: 0 lỗi không dấu, 0 lỗi cấu trúc
- 16/16 files pass verification

Co-Authored-By: Claude Opus 4.6 (1M context) <noreply@anthropic.com>
</commit_message>
<xml_diff>
--- a/web/docs/14_HoangTrungHoc_2025_AJPR.docx
+++ b/web/docs/14_HoangTrungHoc_2025_AJPR.docx
@@ -3133,14 +3133,16 @@
       </w:tr>
     </w:tbl>
     <w:p>
+      <w:pPr>
+        <w:pStyle w:val="Heading2"/>
+      </w:pPr>
       <w:r>
         <w:rPr>
           <w:rFonts w:ascii="Times New Roman" w:hAnsi="Times New Roman"/>
           <w:b/>
           <w:color w:val="FF0000"/>
-          <w:sz w:val="26"/>
         </w:rPr>
-        <w:t>PHẢN BIỆN CHI TIẾT</w:t>
+        <w:t>QUAN ĐIỂM PHẢN BIỆN / CRITICAL REVIEW</w:t>
       </w:r>
     </w:p>
     <w:p>

</xml_diff>

<commit_message>
Áp dụng CTH v5 + thêm 13 tóm tắt mới
- CTH v5 (KT1, KT3, Kiến trúc B) vào bản dịch 14-16
- 5 tóm tắt VN: HTH, NAV, BQ, DL, AG
- 8 tóm tắt QT: Norway, JAACAP, WHO Europe, Nature, AJP, CBT
- 0 lỗi không dấu, 0 lỗi cấu trúc

Co-Authored-By: Claude Opus 4.6 (1M context) <noreply@anthropic.com>
</commit_message>
<xml_diff>
--- a/web/docs/14_HoangTrungHoc_2025_AJPR.docx
+++ b/web/docs/14_HoangTrungHoc_2025_AJPR.docx
@@ -455,6 +455,17 @@
           <w:sz w:val="24"/>
         </w:rPr>
         <w:t>• Lấy mẫu thuận tiện ngẫu nhiên (convenient random sampling) — hạn chế tính đại diện.</w:t>
+      </w:r>
+    </w:p>
+    <w:p>
+      <w:r>
+        <w:rPr>
+          <w:rFonts w:ascii="Times New Roman" w:hAnsi="Times New Roman"/>
+          <w:i/>
+          <w:color w:val="0070C0"/>
+          <w:sz w:val="22"/>
+        </w:rPr>
+        <w:t>Nói cách khác, đây là nghiên cứu cắt ngang tại hai thời điểm — không phải nghiên cứu dọc thực sự — so sánh mức độ rối loạn cảm xúc ở thanh thiếu niên Việt Nam trước và sau khi COVID-19 kết thúc.</w:t>
       </w:r>
     </w:p>
     <w:p>
@@ -3133,6 +3144,25 @@
       </w:tr>
     </w:tbl>
     <w:p>
+      <w:r>
+        <w:rPr>
+          <w:rFonts w:ascii="Times New Roman" w:hAnsi="Times New Roman"/>
+          <w:b/>
+          <w:color w:val="0070C0"/>
+          <w:sz w:val="24"/>
+        </w:rPr>
+        <w:t xml:space="preserve">Nhận định tổng hợp (Kiến trúc B): </w:t>
+      </w:r>
+      <w:r>
+        <w:rPr>
+          <w:rFonts w:ascii="Times New Roman" w:hAnsi="Times New Roman"/>
+          <w:color w:val="0070C0"/>
+          <w:sz w:val="24"/>
+        </w:rPr>
+        <w:t>Dữ liệu của nghiên cứu này, cho thấy sự giảm đáng kể các triệu chứng cảm xúc tiêu cực sau đại dịch (lo âu giảm từ 41,5% xuống 25,4%), gợi ý rằng thanh thiếu niên có khả năng phục hồi nhất định nhưng tỷ lệ hậu COVID vẫn cao hơn trước dịch — điều này đòi hỏi tiếp tục hỗ trợ tâm lý dài hạn.</w:t>
+      </w:r>
+    </w:p>
+    <w:p>
       <w:pPr>
         <w:pStyle w:val="Heading2"/>
       </w:pPr>
@@ -3143,6 +3173,25 @@
           <w:color w:val="FF0000"/>
         </w:rPr>
         <w:t>QUAN ĐIỂM PHẢN BIỆN / CRITICAL REVIEW</w:t>
+      </w:r>
+    </w:p>
+    <w:p>
+      <w:r>
+        <w:rPr>
+          <w:rFonts w:ascii="Times New Roman" w:hAnsi="Times New Roman"/>
+          <w:b/>
+          <w:color w:val="FF0000"/>
+          <w:sz w:val="22"/>
+        </w:rPr>
+        <w:t xml:space="preserve">Đối chiếu giới tính (KT3): </w:t>
+      </w:r>
+      <w:r>
+        <w:rPr>
+          <w:rFonts w:ascii="Times New Roman" w:hAnsi="Times New Roman"/>
+          <w:color w:val="FF0000"/>
+          <w:sz w:val="22"/>
+        </w:rPr>
+        <w:t>Bài báo ghi nhận giới tính có ảnh hưởng (Beta = 0,053, P = 0,001) nhưng không phân tích riêng tỷ lệ lo âu nam vs nữ — đây là một thiếu sót phương pháp luận khi hầu hết nghiên cứu quốc tế đều so sánh giới chi tiết (McLean và cộng sự, 2011).</w:t>
       </w:r>
     </w:p>
     <w:p>

</xml_diff>